<commit_message>
updates to figures and report
</commit_message>
<xml_diff>
--- a/report.docx
+++ b/report.docx
@@ -96,20 +96,134 @@
     </w:p>
     <w:p>
       <w:pPr>
+        <w:rPr>
+          <w:lang w:val="fr-CA"/>
+        </w:rPr>
+      </w:pPr>
+      <w:r>
+        <w:rPr>
+          <w:lang w:val="fr-CA"/>
+        </w:rPr>
+        <w:t>François Turcotte</w:t>
+      </w:r>
+      <w:r>
+        <w:rPr>
+          <w:vertAlign w:val="superscript"/>
+          <w:lang w:val="fr-CA"/>
+        </w:rPr>
+        <w:t>1</w:t>
+      </w:r>
+      <w:r>
+        <w:rPr>
+          <w:lang w:val="fr-CA"/>
+        </w:rPr>
+        <w:t>, Tim</w:t>
+      </w:r>
+      <w:r>
+        <w:rPr>
+          <w:lang w:val="fr-CA"/>
+        </w:rPr>
+        <w:t>othy J. Barret</w:t>
+      </w:r>
+      <w:r>
+        <w:rPr>
+          <w:vertAlign w:val="superscript"/>
+          <w:lang w:val="fr-CA"/>
+        </w:rPr>
+        <w:t>2</w:t>
+      </w:r>
+    </w:p>
+    <w:p>
+      <w:r>
+        <w:rPr>
+          <w:vertAlign w:val="superscript"/>
+        </w:rPr>
+        <w:t>1</w:t>
+      </w:r>
+      <w:r>
+        <w:t>Fisheries and Oceans Canada, Gulf Fisheries Centre, Moncton, NB E1C 9B6, Canada</w:t>
+      </w:r>
+    </w:p>
+    <w:p>
+      <w:pPr>
         <w:pStyle w:val="Heading1"/>
         <w:rPr>
-          <w:rFonts w:ascii="Arial" w:hAnsi="Arial" w:cs="Arial"/>
-          <w:sz w:val="24"/>
-          <w:szCs w:val="24"/>
-        </w:rPr>
-      </w:pPr>
-      <w:r>
-        <w:rPr>
-          <w:rFonts w:ascii="Arial" w:hAnsi="Arial" w:cs="Arial"/>
+          <w:rFonts w:asciiTheme="minorHAnsi" w:eastAsiaTheme="minorHAnsi" w:hAnsiTheme="minorHAnsi" w:cstheme="minorBidi"/>
           <w:color w:val="auto"/>
           <w:sz w:val="24"/>
           <w:szCs w:val="24"/>
         </w:rPr>
+      </w:pPr>
+      <w:r>
+        <w:rPr>
+          <w:rFonts w:asciiTheme="minorHAnsi" w:eastAsiaTheme="minorHAnsi" w:hAnsiTheme="minorHAnsi" w:cstheme="minorBidi"/>
+          <w:color w:val="auto"/>
+          <w:sz w:val="24"/>
+          <w:szCs w:val="24"/>
+          <w:vertAlign w:val="superscript"/>
+        </w:rPr>
+        <w:t>2</w:t>
+      </w:r>
+      <w:r>
+        <w:rPr>
+          <w:rFonts w:asciiTheme="minorHAnsi" w:eastAsiaTheme="minorHAnsi" w:hAnsiTheme="minorHAnsi" w:cstheme="minorBidi"/>
+          <w:color w:val="auto"/>
+          <w:sz w:val="24"/>
+          <w:szCs w:val="24"/>
+        </w:rPr>
+        <w:t>Fisheries and Oceans Canada, St. Andrews Biological Station, St Andrews, NB E5B 2L9, Canada</w:t>
+      </w:r>
+    </w:p>
+    <w:p/>
+    <w:p>
+      <w:r>
+        <w:t xml:space="preserve">Keywords: Atlantic Cod, stock recovery, Allee effects, population dynamics  </w:t>
+      </w:r>
+    </w:p>
+    <w:p/>
+    <w:p>
+      <w:r>
+        <w:t>Abstract</w:t>
+      </w:r>
+    </w:p>
+    <w:p>
+      <w:r>
+        <w:t>Limited recovery following widespread collapses of Atlantic cod (Gadus morhua) stocks suggests that depensatory processes may constrain rebuilding. We evaluated the presence and strength of Allee effects across 24 cod stocks using a surplus production framework that integrates recruitment, somatic growth, and natural mortality. Surplus production was derived from catch and biomass time series, and per capita production rates were analyzed as a function of biomass using segmented regressions to identify Allee effect thresholds. The strength of depensation was quantified as the relative reduction in production at low biomass compared to expected compensatory dynamics.</w:t>
+      </w:r>
+      <w:r>
+        <w:t xml:space="preserve"> </w:t>
+      </w:r>
+      <w:r>
+        <w:t>All stocks declined below a proxy limit reference point (40% of maximum observed biomass), indicating widespread collapse; however, recovery trajectories varied substantially. Stocks that recovered generally maintained positive production at low biomass and exhibited weak or no evidence of Allee effects. In contrast, non-recovering stocks frequently displayed strong depensatory dynamics, with near-zero or negative production at their lowest observed biomass. The strength of the Allee effect was positively associated with both the severity of depletion and the likelihood of failed recovery. Some stocks without detectable Allee effects also failed to recover, reflecting persistently low productivity across their biomass range.</w:t>
+      </w:r>
+      <w:r>
+        <w:t xml:space="preserve"> </w:t>
+      </w:r>
+      <w:r>
+        <w:t>These results demonstrate that surplus production dynamics provide a robust and integrative framework for detecting and quantifying Allee effects. Recovery potential in Atlantic cod appears to depend jointly on depletion severity, productivity at low biomass, and the strength of depensatory processes.</w:t>
+      </w:r>
+      <w:r>
+        <w:br w:type="page"/>
+      </w:r>
+    </w:p>
+    <w:p>
+      <w:pPr>
+        <w:pStyle w:val="Heading1"/>
+        <w:rPr>
+          <w:rFonts w:ascii="Arial" w:hAnsi="Arial" w:cs="Arial"/>
+          <w:sz w:val="24"/>
+          <w:szCs w:val="24"/>
+        </w:rPr>
+      </w:pPr>
+      <w:bookmarkStart w:id="0" w:name="_Hlk224820388"/>
+      <w:r>
+        <w:rPr>
+          <w:rFonts w:ascii="Arial" w:hAnsi="Arial" w:cs="Arial"/>
+          <w:color w:val="auto"/>
+          <w:sz w:val="24"/>
+          <w:szCs w:val="24"/>
+        </w:rPr>
+        <w:lastRenderedPageBreak/>
         <w:t>Introduction</w:t>
       </w:r>
     </w:p>
@@ -265,26 +379,26 @@
         <w:rPr>
           <w:rFonts w:ascii="Arial" w:hAnsi="Arial" w:cs="Arial"/>
         </w:rPr>
-        <w:t xml:space="preserve">Here, we use surplus production dynamics to examine the presence and strength of Allee effects across multiple Atlantic cod stocks within a common analytical framework, </w:t>
+        <w:t xml:space="preserve">Here, we use surplus production dynamics to examine the presence and strength of Allee effects across multiple Atlantic cod stocks within a common analytical framework, with particular emphasis on how productivity changes at low biomass and how these changes relate to recovery following collapse. Specifically, we assess whether cod stocks exhibit Allee effect thresholds </w:t>
+      </w:r>
+      <w:r>
+        <w:rPr>
+          <w:rFonts w:ascii="Arial" w:hAnsi="Arial" w:cs="Arial"/>
+        </w:rPr>
+        <w:t xml:space="preserve">and Allee thresholds </w:t>
+      </w:r>
+      <w:r>
+        <w:rPr>
+          <w:rFonts w:ascii="Arial" w:hAnsi="Arial" w:cs="Arial"/>
+        </w:rPr>
+        <w:t xml:space="preserve">in surplus production </w:t>
       </w:r>
       <w:r>
         <w:rPr>
           <w:rFonts w:ascii="Arial" w:hAnsi="Arial" w:cs="Arial"/>
         </w:rPr>
         <w:lastRenderedPageBreak/>
-        <w:t xml:space="preserve">with particular emphasis on how productivity changes at low biomass and how these changes relate to recovery following collapse. Specifically, we assess whether cod stocks exhibit Allee effect thresholds </w:t>
-      </w:r>
-      <w:r>
-        <w:rPr>
-          <w:rFonts w:ascii="Arial" w:hAnsi="Arial" w:cs="Arial"/>
-        </w:rPr>
-        <w:t xml:space="preserve">and Allee thresholds </w:t>
-      </w:r>
-      <w:r>
-        <w:rPr>
-          <w:rFonts w:ascii="Arial" w:hAnsi="Arial" w:cs="Arial"/>
-        </w:rPr>
-        <w:t>in surplus production dynamics, quantify the strength of depensatory effects using a consistent production-based approach, and evaluate whether variation in Allee effect strength</w:t>
+        <w:t>dynamics, quantify the strength of depensatory effects using a consistent production-based approach, and evaluate whether variation in Allee effect strength</w:t>
       </w:r>
       <w:r>
         <w:rPr>
@@ -992,7 +1106,7 @@
           <w:sz w:val="20"/>
           <w:szCs w:val="20"/>
         </w:rPr>
-        <w:t>: Atlantic cod stock identification label (Stock ID), stock unit definition, year range of data, primary country of management and data source.</w:t>
+        <w:t>: Atlantic cod stock identification label (Stock ID), stock unit definition, year range of data and data source.</w:t>
       </w:r>
     </w:p>
     <w:tbl>
@@ -2051,7 +2165,7 @@
                 <w:szCs w:val="18"/>
                 <w14:ligatures w14:val="none"/>
               </w:rPr>
-              <w:t>COD5Zjm</w:t>
+              <w:t>5Zjm</w:t>
             </w:r>
           </w:p>
         </w:tc>
@@ -2682,7 +2796,7 @@
                 <w:szCs w:val="18"/>
                 <w14:ligatures w14:val="none"/>
               </w:rPr>
-              <w:t>COD3NO</w:t>
+              <w:t>3NO</w:t>
             </w:r>
           </w:p>
         </w:tc>
@@ -2817,7 +2931,7 @@
                 <w:szCs w:val="18"/>
                 <w14:ligatures w14:val="none"/>
               </w:rPr>
-              <w:t>COD1IN</w:t>
+              <w:t>1IN</w:t>
             </w:r>
           </w:p>
         </w:tc>
@@ -2952,7 +3066,7 @@
                 <w:szCs w:val="18"/>
                 <w14:ligatures w14:val="none"/>
               </w:rPr>
-              <w:t>COD1F-XIV</w:t>
+              <w:t>1F-XIV</w:t>
             </w:r>
           </w:p>
         </w:tc>
@@ -3126,7 +3240,7 @@
                 <w:szCs w:val="18"/>
                 <w14:ligatures w14:val="none"/>
               </w:rPr>
-              <w:t>CODBA2224</w:t>
+              <w:t>BA2224</w:t>
             </w:r>
           </w:p>
         </w:tc>
@@ -3264,7 +3378,7 @@
                 <w:szCs w:val="18"/>
                 <w14:ligatures w14:val="none"/>
               </w:rPr>
-              <w:t>CODBA2532</w:t>
+              <w:t>BA2532</w:t>
             </w:r>
           </w:p>
         </w:tc>
@@ -3402,7 +3516,7 @@
                 <w:szCs w:val="18"/>
                 <w14:ligatures w14:val="none"/>
               </w:rPr>
-              <w:t>CODFAPL</w:t>
+              <w:t>FAPL</w:t>
             </w:r>
           </w:p>
         </w:tc>
@@ -3540,7 +3654,7 @@
                 <w:szCs w:val="18"/>
                 <w14:ligatures w14:val="none"/>
               </w:rPr>
-              <w:t>CODICE</w:t>
+              <w:t>ICE</w:t>
             </w:r>
           </w:p>
         </w:tc>
@@ -3678,7 +3792,7 @@
                 <w:szCs w:val="18"/>
                 <w14:ligatures w14:val="none"/>
               </w:rPr>
-              <w:t>CODIIIaW-IV-VIId</w:t>
+              <w:t>IIIaW-IV-VIId</w:t>
             </w:r>
           </w:p>
         </w:tc>
@@ -3816,7 +3930,7 @@
                 <w:szCs w:val="18"/>
                 <w14:ligatures w14:val="none"/>
               </w:rPr>
-              <w:t>CODIS</w:t>
+              <w:t>IS</w:t>
             </w:r>
           </w:p>
         </w:tc>
@@ -3954,7 +4068,7 @@
                 <w:szCs w:val="18"/>
                 <w14:ligatures w14:val="none"/>
               </w:rPr>
-              <w:t>CODNEAR</w:t>
+              <w:t>NEAR</w:t>
             </w:r>
           </w:p>
         </w:tc>
@@ -4092,7 +4206,7 @@
                 <w:szCs w:val="18"/>
                 <w14:ligatures w14:val="none"/>
               </w:rPr>
-              <w:t>CODVIa</w:t>
+              <w:t>VIa</w:t>
             </w:r>
           </w:p>
         </w:tc>
@@ -4230,7 +4344,7 @@
                 <w:szCs w:val="18"/>
                 <w14:ligatures w14:val="none"/>
               </w:rPr>
-              <w:t>CODVIIek</w:t>
+              <w:t>VIIek</w:t>
             </w:r>
           </w:p>
         </w:tc>
@@ -5069,6 +5183,7 @@
         <w:pStyle w:val="Heading1"/>
         <w:rPr>
           <w:rFonts w:ascii="Arial" w:hAnsi="Arial" w:cs="Arial"/>
+          <w:color w:val="auto"/>
           <w:sz w:val="24"/>
           <w:szCs w:val="24"/>
         </w:rPr>
@@ -5076,6 +5191,7 @@
       <w:r>
         <w:rPr>
           <w:rFonts w:ascii="Arial" w:hAnsi="Arial" w:cs="Arial"/>
+          <w:color w:val="auto"/>
           <w:sz w:val="24"/>
           <w:szCs w:val="24"/>
         </w:rPr>
@@ -5117,10 +5233,10 @@
         </w:rPr>
         <w:lastRenderedPageBreak/>
         <w:drawing>
-          <wp:inline distT="0" distB="0" distL="0" distR="0" wp14:anchorId="6A1636A3" wp14:editId="7EF57A67">
-            <wp:extent cx="5943600" cy="5094605"/>
+          <wp:inline distT="0" distB="0" distL="0" distR="0" wp14:anchorId="6A1636A3" wp14:editId="0A4C97F3">
+            <wp:extent cx="5943600" cy="5094514"/>
             <wp:effectExtent l="0" t="0" r="0" b="0"/>
-            <wp:docPr id="373939452" name="Picture 1" descr="A graph of different types of graphs&#10;&#10;AI-generated content may be incorrect."/>
+            <wp:docPr id="373939452" name="Picture 1"/>
             <wp:cNvGraphicFramePr>
               <a:graphicFrameLocks xmlns:a="http://schemas.openxmlformats.org/drawingml/2006/main" noChangeAspect="1"/>
             </wp:cNvGraphicFramePr>
@@ -5128,7 +5244,7 @@
               <a:graphicData uri="http://schemas.openxmlformats.org/drawingml/2006/picture">
                 <pic:pic xmlns:pic="http://schemas.openxmlformats.org/drawingml/2006/picture">
                   <pic:nvPicPr>
-                    <pic:cNvPr id="373939452" name="Picture 1" descr="A graph of different types of graphs&#10;&#10;AI-generated content may be incorrect."/>
+                    <pic:cNvPr id="373939452" name="Picture 1"/>
                     <pic:cNvPicPr>
                       <a:picLocks noChangeAspect="1" noChangeArrowheads="1"/>
                     </pic:cNvPicPr>
@@ -5141,7 +5257,6 @@
                         </a:ext>
                       </a:extLst>
                     </a:blip>
-                    <a:srcRect/>
                     <a:stretch>
                       <a:fillRect/>
                     </a:stretch>
@@ -5149,7 +5264,7 @@
                   <pic:spPr bwMode="auto">
                     <a:xfrm>
                       <a:off x="0" y="0"/>
-                      <a:ext cx="5943600" cy="5094605"/>
+                      <a:ext cx="5943600" cy="5094514"/>
                     </a:xfrm>
                     <a:prstGeom prst="rect">
                       <a:avLst/>
@@ -5296,14 +5411,6 @@
         <w:t>the assumed stock biomass limit reference point.</w:t>
       </w:r>
     </w:p>
-    <w:p>
-      <w:r>
-        <w:rPr>
-          <w:highlight w:val="yellow"/>
-        </w:rPr>
-        <w:t>Remove COD in front of names</w:t>
-      </w:r>
-    </w:p>
     <w:p/>
     <w:p>
       <w:pPr>
@@ -5321,10 +5428,10 @@
           <w:noProof/>
         </w:rPr>
         <w:drawing>
-          <wp:inline distT="0" distB="0" distL="0" distR="0" wp14:anchorId="1102DD80" wp14:editId="0162E5B9">
-            <wp:extent cx="5486400" cy="4572000"/>
-            <wp:effectExtent l="0" t="0" r="0" b="0"/>
-            <wp:docPr id="1555986496" name="Picture 4" descr="A group of graphs with numbers and lines&#10;&#10;AI-generated content may be incorrect."/>
+          <wp:inline distT="0" distB="0" distL="0" distR="0" wp14:anchorId="1102DD80" wp14:editId="3CCAD9A6">
+            <wp:extent cx="5486400" cy="4571999"/>
+            <wp:effectExtent l="0" t="0" r="0" b="635"/>
+            <wp:docPr id="1555986496" name="Picture 4"/>
             <wp:cNvGraphicFramePr>
               <a:graphicFrameLocks xmlns:a="http://schemas.openxmlformats.org/drawingml/2006/main" noChangeAspect="1"/>
             </wp:cNvGraphicFramePr>
@@ -5332,7 +5439,7 @@
               <a:graphicData uri="http://schemas.openxmlformats.org/drawingml/2006/picture">
                 <pic:pic xmlns:pic="http://schemas.openxmlformats.org/drawingml/2006/picture">
                   <pic:nvPicPr>
-                    <pic:cNvPr id="1555986496" name="Picture 4" descr="A group of graphs with numbers and lines&#10;&#10;AI-generated content may be incorrect."/>
+                    <pic:cNvPr id="1555986496" name="Picture 4"/>
                     <pic:cNvPicPr>
                       <a:picLocks noChangeAspect="1" noChangeArrowheads="1"/>
                     </pic:cNvPicPr>
@@ -5345,7 +5452,6 @@
                         </a:ext>
                       </a:extLst>
                     </a:blip>
-                    <a:srcRect/>
                     <a:stretch>
                       <a:fillRect/>
                     </a:stretch>
@@ -5353,7 +5459,7 @@
                   <pic:spPr bwMode="auto">
                     <a:xfrm>
                       <a:off x="0" y="0"/>
-                      <a:ext cx="5486400" cy="4572000"/>
+                      <a:ext cx="5486400" cy="4571999"/>
                     </a:xfrm>
                     <a:prstGeom prst="rect">
                       <a:avLst/>
@@ -5524,10 +5630,10 @@
         </w:rPr>
         <w:lastRenderedPageBreak/>
         <w:drawing>
-          <wp:inline distT="0" distB="0" distL="0" distR="0" wp14:anchorId="3E6A4077" wp14:editId="47D62FD3">
-            <wp:extent cx="5943600" cy="6792595"/>
-            <wp:effectExtent l="0" t="0" r="0" b="8255"/>
-            <wp:docPr id="221779071" name="Picture 2" descr="A graph of different types of data&#10;&#10;AI-generated content may be incorrect."/>
+          <wp:inline distT="0" distB="0" distL="0" distR="0" wp14:anchorId="3E6A4077" wp14:editId="03794A84">
+            <wp:extent cx="5943600" cy="5094514"/>
+            <wp:effectExtent l="0" t="0" r="0" b="0"/>
+            <wp:docPr id="221779071" name="Picture 2"/>
             <wp:cNvGraphicFramePr>
               <a:graphicFrameLocks xmlns:a="http://schemas.openxmlformats.org/drawingml/2006/main" noChangeAspect="1"/>
             </wp:cNvGraphicFramePr>
@@ -5535,7 +5641,7 @@
               <a:graphicData uri="http://schemas.openxmlformats.org/drawingml/2006/picture">
                 <pic:pic xmlns:pic="http://schemas.openxmlformats.org/drawingml/2006/picture">
                   <pic:nvPicPr>
-                    <pic:cNvPr id="221779071" name="Picture 2" descr="A graph of different types of data&#10;&#10;AI-generated content may be incorrect."/>
+                    <pic:cNvPr id="221779071" name="Picture 2"/>
                     <pic:cNvPicPr>
                       <a:picLocks noChangeAspect="1" noChangeArrowheads="1"/>
                     </pic:cNvPicPr>
@@ -5548,7 +5654,6 @@
                         </a:ext>
                       </a:extLst>
                     </a:blip>
-                    <a:srcRect/>
                     <a:stretch>
                       <a:fillRect/>
                     </a:stretch>
@@ -5556,7 +5661,7 @@
                   <pic:spPr bwMode="auto">
                     <a:xfrm>
                       <a:off x="0" y="0"/>
-                      <a:ext cx="5943600" cy="6792595"/>
+                      <a:ext cx="5943600" cy="5094514"/>
                     </a:xfrm>
                     <a:prstGeom prst="rect">
                       <a:avLst/>
@@ -5636,44 +5741,130 @@
           <w:sz w:val="20"/>
           <w:szCs w:val="20"/>
         </w:rPr>
-        <w:t xml:space="preserve">Atlantic cod stocks production rate (y axis) in function of biomass (x axis)  the blue solid line is a linear regression line </w:t>
+        <w:t xml:space="preserve">Depensation stocks; </w:t>
       </w:r>
       <w:r>
         <w:rPr>
           <w:sz w:val="20"/>
           <w:szCs w:val="20"/>
         </w:rPr>
-        <w:t>over the range of data</w:t>
+        <w:t xml:space="preserve">Atlantic cod stocks production rate (y axis) in function of biomass (x axis)  the blue solid line is a linear regression line </w:t>
       </w:r>
       <w:r>
         <w:rPr>
           <w:sz w:val="20"/>
           <w:szCs w:val="20"/>
         </w:rPr>
+        <w:t>over the range of data</w:t>
+      </w:r>
+      <w:r>
+        <w:rPr>
+          <w:sz w:val="20"/>
+          <w:szCs w:val="20"/>
+        </w:rPr>
         <w:t>, showing only stock where a linear regression had lower AIC than a segmented regression model.</w:t>
       </w:r>
     </w:p>
     <w:p>
-      <w:r>
-        <w:rPr>
-          <w:highlight w:val="yellow"/>
-        </w:rPr>
-        <w:t xml:space="preserve">Split figure 4 in depensatory </w:t>
-      </w:r>
-      <w:r>
-        <w:rPr>
-          <w:highlight w:val="yellow"/>
-        </w:rPr>
-        <w:t xml:space="preserve">(and lack of compensation = non significant negative cruve or 0 slope curve) </w:t>
-      </w:r>
-      <w:r>
-        <w:rPr>
-          <w:highlight w:val="yellow"/>
-        </w:rPr>
-        <w:t>vs compensatory stocks</w:t>
-      </w:r>
-      <w:r>
-        <w:br w:type="page"/>
+      <w:pPr>
+        <w:keepNext/>
+      </w:pPr>
+      <w:r>
+        <w:rPr>
+          <w:noProof/>
+        </w:rPr>
+        <w:lastRenderedPageBreak/>
+        <w:drawing>
+          <wp:inline distT="0" distB="0" distL="0" distR="0" wp14:anchorId="2959C4D1" wp14:editId="1BA77D29">
+            <wp:extent cx="5943520" cy="6792594"/>
+            <wp:effectExtent l="0" t="0" r="635" b="8890"/>
+            <wp:docPr id="1277538786" name="Picture 2"/>
+            <wp:cNvGraphicFramePr>
+              <a:graphicFrameLocks xmlns:a="http://schemas.openxmlformats.org/drawingml/2006/main" noChangeAspect="1"/>
+            </wp:cNvGraphicFramePr>
+            <a:graphic xmlns:a="http://schemas.openxmlformats.org/drawingml/2006/main">
+              <a:graphicData uri="http://schemas.openxmlformats.org/drawingml/2006/picture">
+                <pic:pic xmlns:pic="http://schemas.openxmlformats.org/drawingml/2006/picture">
+                  <pic:nvPicPr>
+                    <pic:cNvPr id="1277538786" name="Picture 2"/>
+                    <pic:cNvPicPr>
+                      <a:picLocks noChangeAspect="1" noChangeArrowheads="1"/>
+                    </pic:cNvPicPr>
+                  </pic:nvPicPr>
+                  <pic:blipFill>
+                    <a:blip r:embed="rId11" cstate="print">
+                      <a:extLst>
+                        <a:ext uri="{28A0092B-C50C-407E-A947-70E740481C1C}">
+                          <a14:useLocalDpi xmlns:a14="http://schemas.microsoft.com/office/drawing/2010/main" val="0"/>
+                        </a:ext>
+                      </a:extLst>
+                    </a:blip>
+                    <a:stretch>
+                      <a:fillRect/>
+                    </a:stretch>
+                  </pic:blipFill>
+                  <pic:spPr bwMode="auto">
+                    <a:xfrm>
+                      <a:off x="0" y="0"/>
+                      <a:ext cx="5943520" cy="6792594"/>
+                    </a:xfrm>
+                    <a:prstGeom prst="rect">
+                      <a:avLst/>
+                    </a:prstGeom>
+                    <a:noFill/>
+                    <a:ln>
+                      <a:noFill/>
+                    </a:ln>
+                  </pic:spPr>
+                </pic:pic>
+              </a:graphicData>
+            </a:graphic>
+          </wp:inline>
+        </w:drawing>
+      </w:r>
+    </w:p>
+    <w:p>
+      <w:r>
+        <w:rPr>
+          <w:sz w:val="20"/>
+          <w:szCs w:val="20"/>
+        </w:rPr>
+        <w:t xml:space="preserve">Figure </w:t>
+      </w:r>
+      <w:r>
+        <w:rPr>
+          <w:sz w:val="20"/>
+          <w:szCs w:val="20"/>
+        </w:rPr>
+        <w:t>5</w:t>
+      </w:r>
+      <w:r>
+        <w:rPr>
+          <w:sz w:val="20"/>
+          <w:szCs w:val="20"/>
+        </w:rPr>
+        <w:t xml:space="preserve">: </w:t>
+      </w:r>
+      <w:r>
+        <w:rPr>
+          <w:sz w:val="20"/>
+          <w:szCs w:val="20"/>
+        </w:rPr>
+        <w:t>Com</w:t>
+      </w:r>
+      <w:r>
+        <w:rPr>
+          <w:sz w:val="20"/>
+          <w:szCs w:val="20"/>
+        </w:rPr>
+        <w:t xml:space="preserve">pensation stocks; </w:t>
+      </w:r>
+      <w:r>
+        <w:rPr>
+          <w:sz w:val="20"/>
+          <w:szCs w:val="20"/>
+        </w:rPr>
+        <w:t>Atlantic cod stocks production rate (y axis) in function of biomass (x axis)  the blue solid line is a linear regression line over the range of data, showing only stock where a linear regression had lower AIC than a segmented regression model</w:t>
       </w:r>
     </w:p>
     <w:p>
@@ -7287,7 +7478,7 @@
                 <w:szCs w:val="18"/>
                 <w14:ligatures w14:val="none"/>
               </w:rPr>
-              <w:t>COD1IN</w:t>
+              <w:t>1IN</w:t>
             </w:r>
           </w:p>
         </w:tc>
@@ -8093,7 +8284,7 @@
                 <w:szCs w:val="18"/>
                 <w14:ligatures w14:val="none"/>
               </w:rPr>
-              <w:t>COD1F-XIV</w:t>
+              <w:t>1F-XIV</w:t>
             </w:r>
           </w:p>
         </w:tc>
@@ -8293,7 +8484,7 @@
                 <w:szCs w:val="18"/>
                 <w14:ligatures w14:val="none"/>
               </w:rPr>
-              <w:t>COD5Zjm</w:t>
+              <w:t>5Zjm</w:t>
             </w:r>
           </w:p>
         </w:tc>
@@ -9129,7 +9320,7 @@
                 <w:szCs w:val="18"/>
                 <w14:ligatures w14:val="none"/>
               </w:rPr>
-              <w:t>CODIIIaW-IV-VIId</w:t>
+              <w:t>IIIaW-IV-VIId</w:t>
             </w:r>
           </w:p>
         </w:tc>
@@ -9329,7 +9520,7 @@
                 <w:szCs w:val="18"/>
                 <w14:ligatures w14:val="none"/>
               </w:rPr>
-              <w:t>CODICE</w:t>
+              <w:t>ICE</w:t>
             </w:r>
           </w:p>
         </w:tc>
@@ -9530,7 +9721,7 @@
                 <w:szCs w:val="18"/>
                 <w14:ligatures w14:val="none"/>
               </w:rPr>
-              <w:t>CODBA2224</w:t>
+              <w:t>BA2224</w:t>
             </w:r>
           </w:p>
         </w:tc>
@@ -9735,7 +9926,7 @@
                 <w:szCs w:val="18"/>
                 <w14:ligatures w14:val="none"/>
               </w:rPr>
-              <w:t>CODNEAR</w:t>
+              <w:t>NEAR</w:t>
             </w:r>
           </w:p>
         </w:tc>
@@ -9938,7 +10129,7 @@
                 <w:szCs w:val="18"/>
                 <w14:ligatures w14:val="none"/>
               </w:rPr>
-              <w:t>CODBA2532</w:t>
+              <w:t>BA2532</w:t>
             </w:r>
           </w:p>
         </w:tc>
@@ -10143,7 +10334,7 @@
                 <w:szCs w:val="18"/>
                 <w14:ligatures w14:val="none"/>
               </w:rPr>
-              <w:t>CODFAPL</w:t>
+              <w:t>FAPL</w:t>
             </w:r>
           </w:p>
         </w:tc>
@@ -10348,7 +10539,7 @@
                 <w:szCs w:val="18"/>
                 <w14:ligatures w14:val="none"/>
               </w:rPr>
-              <w:t>CODVIIek</w:t>
+              <w:t>VIIek</w:t>
             </w:r>
           </w:p>
         </w:tc>
@@ -10553,7 +10744,7 @@
                 <w:szCs w:val="18"/>
                 <w14:ligatures w14:val="none"/>
               </w:rPr>
-              <w:t>CODVIa</w:t>
+              <w:t>VIa</w:t>
             </w:r>
           </w:p>
         </w:tc>
@@ -10756,7 +10947,7 @@
                 <w:szCs w:val="18"/>
                 <w14:ligatures w14:val="none"/>
               </w:rPr>
-              <w:t>CODIS</w:t>
+              <w:t>IS</w:t>
             </w:r>
           </w:p>
         </w:tc>
@@ -11183,6 +11374,7 @@
         <w:t>Atlantic cod in the sGSL are currently experiencing a strong Allee effect, with the rate of surplus production declining to neg- ative values as population biomass has decreased over the past decade. Changes in recruitment dynamics do not appear to be the primary cause of this negative productivity. While there does ap- pear to have been a weakening in recruitment compensation be- tween the 1970s and 1990s (cf. Keith and Hutchings 2012), there is no evidence for depensatory recruitment dynamics in this stock.</w:t>
       </w:r>
     </w:p>
+    <w:bookmarkEnd w:id="0"/>
     <w:p>
       <w:pPr>
         <w:shd w:val="clear" w:color="auto" w:fill="FFFFFF"/>
@@ -11242,6 +11434,13 @@
         </w:rPr>
         <w:t>Mention 2j3kl and 4tvn short time series from assessments but don’t show the results. Just say in the discussion that length of the time series matter for these stocks with very long history of exploitation. Ran with shorter and same result for 4tvn but didn’t detect allee for 2j3kl</w:t>
       </w:r>
+    </w:p>
+    <w:p>
+      <w:pPr>
+        <w:rPr>
+          <w:rFonts w:ascii="Arial" w:hAnsi="Arial" w:cs="Arial"/>
+        </w:rPr>
+      </w:pPr>
     </w:p>
     <w:p>
       <w:pPr>
@@ -11422,7 +11621,7 @@
         </w:rPr>
         <w:t>2151, </w:t>
       </w:r>
-      <w:hyperlink r:id="rId11" w:history="1">
+      <w:hyperlink r:id="rId12" w:history="1">
         <w:r>
           <w:rPr>
             <w:rFonts w:ascii="Arial" w:hAnsi="Arial" w:cs="Arial"/>
@@ -11576,7 +11775,7 @@
         <w:lastRenderedPageBreak/>
         <w:t>Ricard, D., Minto, C., Jensen, O.P. and Baum, J.K. (2012) Evaluating the knowledge base and status of commercially exploited marine species with the RAM Legacy Stock Assessment Database. Fish and Fisheries 13 (4) 380-398. DOI: </w:t>
       </w:r>
-      <w:hyperlink r:id="rId12" w:history="1">
+      <w:hyperlink r:id="rId13" w:history="1">
         <w:r>
           <w:rPr>
             <w:rFonts w:ascii="Arial" w:hAnsi="Arial" w:cs="Arial"/>
@@ -11652,9 +11851,9 @@
       </w:pPr>
     </w:p>
     <w:sectPr>
-      <w:headerReference w:type="even" r:id="rId13"/>
-      <w:headerReference w:type="default" r:id="rId14"/>
-      <w:headerReference w:type="first" r:id="rId15"/>
+      <w:headerReference w:type="even" r:id="rId14"/>
+      <w:headerReference w:type="default" r:id="rId15"/>
+      <w:headerReference w:type="first" r:id="rId16"/>
       <w:pgSz w:w="12240" w:h="15840"/>
       <w:pgMar w:top="1440" w:right="1440" w:bottom="1440" w:left="1440" w:header="720" w:footer="720" w:gutter="0"/>
       <w:cols w:space="720"/>

</xml_diff>